<commit_message>
Day 5: mock interview backend complete - question generation, answer evaluation, session summary
</commit_message>
<xml_diff>
--- a/docs/CareerCopilot_AI_Implementation_Blueprint.docx
+++ b/docs/CareerCopilot_AI_Implementation_Blueprint.docx
@@ -583,6 +583,265 @@
           <w:szCs w:val="21"/>
         </w:rPr>
         <w:t xml:space="preserve">No scope changes were introduced — this addendum formalizes decisions that were already implied by the original Blueprint into precise, implementation-ready detail.</w:t>
+      </w:r>
+    </w:p>
+    <w:p>
+      <w:r>
+        <w:br w:type="page"/>
+      </w:r>
+    </w:p>
+    <w:p>
+      <w:pPr>
+        <w:pStyle w:val="Heading1"/>
+        <w:spacing w:after="160" w:before="300"/>
+      </w:pPr>
+      <w:r>
+        <w:rPr>
+          <w:b/>
+          <w:bCs/>
+          <w:color w:val="1A2B4C"/>
+          <w:sz w:val="30"/>
+          <w:szCs w:val="30"/>
+        </w:rPr>
+        <w:t xml:space="preserve">DAY 3 ADDENDUM — Foundation Build &amp; Gemini Model Resolution (Added After Day 3 Session)</w:t>
+      </w:r>
+    </w:p>
+    <w:p>
+      <w:pPr>
+        <w:pBdr>
+          <w:bottom w:val="single" w:color="D0D5DD" w:sz="6" w:space="4"/>
+        </w:pBdr>
+        <w:spacing w:after="260" w:before="100"/>
+      </w:pPr>
+    </w:p>
+    <w:p>
+      <w:pPr>
+        <w:spacing w:after="140" w:line="300"/>
+      </w:pPr>
+      <w:r>
+        <w:rPr>
+          <w:color w:val="111827"/>
+          <w:sz w:val="21"/>
+          <w:szCs w:val="21"/>
+        </w:rPr>
+        <w:t xml:space="preserve">Day 2's coding tasks (environment setup, dependencies, Gemini connection, Hello World) were deferred to this Day 3 session since Day 2 was fully occupied by system design. All of Blueprint "Day 2"'s original tasks are now complete; Days 4 onward proceed exactly as originally planned, one day later than the original numbering implied — no scope was lost.</w:t>
+      </w:r>
+    </w:p>
+    <w:p>
+      <w:pPr>
+        <w:spacing w:after="140" w:line="300"/>
+      </w:pPr>
+      <w:r>
+        <w:rPr>
+          <w:b/>
+          <w:bCs/>
+          <w:color w:val="111827"/>
+          <w:sz w:val="21"/>
+          <w:szCs w:val="21"/>
+        </w:rPr>
+        <w:t xml:space="preserve">Critical finding for Days 4–5 (prompt/AI work):</w:t>
+      </w:r>
+      <w:r>
+        <w:rPr>
+          <w:color w:val="111827"/>
+          <w:sz w:val="21"/>
+          <w:szCs w:val="21"/>
+        </w:rPr>
+        <w:t xml:space="preserve"> The Gemini model name is </w:t>
+      </w:r>
+      <w:r>
+        <w:rPr>
+          <w:b/>
+          <w:bCs/>
+          <w:color w:val="111827"/>
+          <w:sz w:val="21"/>
+          <w:szCs w:val="21"/>
+        </w:rPr>
+        <w:t xml:space="preserve">`gemini-flash-latest`</w:t>
+      </w:r>
+      <w:r>
+        <w:rPr>
+          <w:color w:val="111827"/>
+          <w:sz w:val="21"/>
+          <w:szCs w:val="21"/>
+        </w:rPr>
+        <w:t xml:space="preserve">, not `gemini-1.5-flash` as referenced in earlier planning. Three other model names (`gemini-1.5-flash`, `gemini-2.5-flash`, `gemini-3.6-flash`) all returned 404 errors before the correct configuration was found by generating a live quickstart snippet from Google AI Studio. Authentication uses the `X-goog-api-key` header, not a `?key=` URL parameter. Full debugging trail in `docs/ENVIRONMENT.md`.</w:t>
+      </w:r>
+    </w:p>
+    <w:p>
+      <w:pPr>
+        <w:spacing w:after="140" w:line="300"/>
+      </w:pPr>
+      <w:r>
+        <w:rPr>
+          <w:b/>
+          <w:bCs/>
+          <w:color w:val="111827"/>
+          <w:sz w:val="21"/>
+          <w:szCs w:val="21"/>
+        </w:rPr>
+        <w:t xml:space="preserve">Action for Day 4–5:</w:t>
+      </w:r>
+      <w:r>
+        <w:rPr>
+          <w:color w:val="111827"/>
+          <w:sz w:val="21"/>
+          <w:szCs w:val="21"/>
+        </w:rPr>
+        <w:t xml:space="preserve"> When writing `server/prompts/roadmapPrompt.js` and `server/prompts/interviewPrompts.js`, copy the exact fetch pattern (model name + header auth) from `server/routes/testGemini.js` rather than re-deriving it. If Gemini returns a 404 again at any point, do not guess a new model name — re-run `curl "https://generativelanguage.googleapis.com/v1beta/models?key=YOUR_KEY"` or regenerate the AI Studio quickstart first.</w:t>
+      </w:r>
+    </w:p>
+    <w:p>
+      <w:pPr>
+        <w:spacing w:after="140" w:line="300"/>
+      </w:pPr>
+      <w:r>
+        <w:rPr>
+          <w:b/>
+          <w:bCs/>
+          <w:color w:val="111827"/>
+          <w:sz w:val="21"/>
+          <w:szCs w:val="21"/>
+        </w:rPr>
+        <w:t xml:space="preserve">Foundation completed today:</w:t>
+      </w:r>
+      <w:r>
+        <w:rPr>
+          <w:color w:val="111827"/>
+          <w:sz w:val="21"/>
+          <w:szCs w:val="21"/>
+        </w:rPr>
+        <w:t xml:space="preserve"> Express server (`server/index.js`), working Gemini connection (`server/routes/testGemini.js`), Hello World frontend (`client/index.html`, `style.css`, `script.js`) with live backend connectivity confirmation. Full-stack request flow verified working end to end.</w:t>
+      </w:r>
+    </w:p>
+    <w:p>
+      <w:r>
+        <w:br w:type="page"/>
+      </w:r>
+    </w:p>
+    <w:p>
+      <w:pPr>
+        <w:pStyle w:val="Heading1"/>
+        <w:spacing w:after="160" w:before="300"/>
+      </w:pPr>
+      <w:r>
+        <w:rPr>
+          <w:b/>
+          <w:bCs/>
+          <w:color w:val="1A2B4C"/>
+          <w:sz w:val="30"/>
+          <w:szCs w:val="30"/>
+        </w:rPr>
+        <w:t xml:space="preserve">DAY 4 ADDENDUM — AI Roadmap Feature Complete (Added After Day 4 Session)</w:t>
+      </w:r>
+    </w:p>
+    <w:p>
+      <w:pPr>
+        <w:pBdr>
+          <w:bottom w:val="single" w:color="D0D5DD" w:sz="6" w:space="4"/>
+        </w:pBdr>
+        <w:spacing w:after="260" w:before="100"/>
+      </w:pPr>
+    </w:p>
+    <w:p>
+      <w:pPr>
+        <w:spacing w:after="140" w:line="300"/>
+      </w:pPr>
+      <w:r>
+        <w:rPr>
+          <w:color w:val="111827"/>
+          <w:sz w:val="21"/>
+          <w:szCs w:val="21"/>
+        </w:rPr>
+        <w:t xml:space="preserve">`POST /api/roadmap` built and verified exactly per `docs/API.md` contract, including in-memory per-role caching. Frontend `role-select.html` and `roadmap.html` fully wired: role selection saves to `cc_selected_role`, roadmap fetches/caches to `cc_roadmap_data_&lt;role&gt;`, and milestone checkboxes persist to `cc_roadmap_progress_&lt;role&gt;` — all three localStorage keys confirmed working via DevTools inspection. No deviation from `docs/SCHEMA.md`.</w:t>
+      </w:r>
+    </w:p>
+    <w:p>
+      <w:r>
+        <w:br w:type="page"/>
+      </w:r>
+    </w:p>
+    <w:p>
+      <w:pPr>
+        <w:pStyle w:val="Heading1"/>
+        <w:spacing w:after="160" w:before="300"/>
+      </w:pPr>
+      <w:r>
+        <w:rPr>
+          <w:b/>
+          <w:bCs/>
+          <w:color w:val="1A2B4C"/>
+          <w:sz w:val="30"/>
+          <w:szCs w:val="30"/>
+        </w:rPr>
+        <w:t xml:space="preserve">DAY 5 ADDENDUM — Mock Interview Backend Complete (Added After Day 5 Session)</w:t>
+      </w:r>
+    </w:p>
+    <w:p>
+      <w:pPr>
+        <w:pBdr>
+          <w:bottom w:val="single" w:color="D0D5DD" w:sz="6" w:space="4"/>
+        </w:pBdr>
+        <w:spacing w:after="260" w:before="100"/>
+      </w:pPr>
+    </w:p>
+    <w:p>
+      <w:pPr>
+        <w:spacing w:after="140" w:line="300"/>
+      </w:pPr>
+      <w:r>
+        <w:rPr>
+          <w:color w:val="111827"/>
+          <w:sz w:val="21"/>
+          <w:szCs w:val="21"/>
+        </w:rPr>
+        <w:t xml:space="preserve">All three interview endpoints (`/api/interview/question`, `/evaluate`, `/summary`) built, tested independently via terminal, and verified matching `docs/API.md` exactly. Reused the same model/auth pattern (`gemini-flash-latest`, `X-goog-api-key` header) established Day 3 and used in Day 4's roadmap route — no new integration pattern needed.</w:t>
+      </w:r>
+    </w:p>
+    <w:p>
+      <w:pPr>
+        <w:spacing w:after="140" w:line="300"/>
+      </w:pPr>
+      <w:r>
+        <w:rPr>
+          <w:b/>
+          <w:bCs/>
+          <w:color w:val="111827"/>
+          <w:sz w:val="21"/>
+          <w:szCs w:val="21"/>
+        </w:rPr>
+        <w:t xml:space="preserve">Key implementation detail for Day 6 UI work:</w:t>
+      </w:r>
+      <w:r>
+        <w:rPr>
+          <w:color w:val="111827"/>
+          <w:sz w:val="21"/>
+          <w:szCs w:val="21"/>
+        </w:rPr>
+        <w:t xml:space="preserve"> `averageScore` in the `/summary` response is computed server-side from the real per-question scores (not left to the AI), so the frontend can trust this number exactly as returned — no client-side recalculation needed when saving to `cc_interview_history`.</w:t>
+      </w:r>
+    </w:p>
+    <w:p>
+      <w:pPr>
+        <w:spacing w:after="140" w:line="300"/>
+      </w:pPr>
+      <w:r>
+        <w:rPr>
+          <w:b/>
+          <w:bCs/>
+          <w:color w:val="111827"/>
+          <w:sz w:val="21"/>
+          <w:szCs w:val="21"/>
+        </w:rPr>
+        <w:t xml:space="preserve">Action for Day 6:</w:t>
+      </w:r>
+      <w:r>
+        <w:rPr>
+          <w:color w:val="111827"/>
+          <w:sz w:val="21"/>
+          <w:szCs w:val="21"/>
+        </w:rPr>
+        <w:t xml:space="preserve"> Build `interview.html`'s conversational state machine (question number, `previousQA` array, running score) using the exact request/response shapes verified today. No backend changes should be needed — Day 6 is frontend-only, per original Blueprint scope.</w:t>
       </w:r>
     </w:p>
     <w:p>

</xml_diff>